<commit_message>
Inclusão mais estatisticas e apresentação da média e mediana no histograma
</commit_message>
<xml_diff>
--- a/Análise descritiva de dados numéricos.docx
+++ b/Análise descritiva de dados numéricos.docx
@@ -41,8 +41,20 @@
           <w:sz w:val="26"/>
           <w:szCs w:val="26"/>
         </w:rPr>
-        <w:t>– Banco de dados life_expectancy</w:t>
-      </w:r>
+        <w:t xml:space="preserve">– Banco de dados </w:t>
+      </w:r>
+      <w:proofErr w:type="spellStart"/>
+      <w:r>
+        <w:rPr>
+          <w:rFonts w:ascii="Segoe UI" w:hAnsi="Segoe UI" w:cs="Segoe UI"/>
+          <w:b/>
+          <w:bCs/>
+          <w:sz w:val="26"/>
+          <w:szCs w:val="26"/>
+        </w:rPr>
+        <w:t>life_expectancy</w:t>
+      </w:r>
+      <w:proofErr w:type="spellEnd"/>
     </w:p>
     <w:p>
       <w:pPr>
@@ -71,7 +83,21 @@
         <w:rPr>
           <w:rFonts w:ascii="Segoe UI" w:hAnsi="Segoe UI" w:cs="Segoe UI"/>
         </w:rPr>
-        <w:t xml:space="preserve"> para obter as medidas abaixo e construir o boxplot e o histograma dos dados.</w:t>
+        <w:t xml:space="preserve"> para obter as medidas abaixo e construir o </w:t>
+      </w:r>
+      <w:proofErr w:type="spellStart"/>
+      <w:r>
+        <w:rPr>
+          <w:rFonts w:ascii="Segoe UI" w:hAnsi="Segoe UI" w:cs="Segoe UI"/>
+        </w:rPr>
+        <w:t>boxplot</w:t>
+      </w:r>
+      <w:proofErr w:type="spellEnd"/>
+      <w:r>
+        <w:rPr>
+          <w:rFonts w:ascii="Segoe UI" w:hAnsi="Segoe UI" w:cs="Segoe UI"/>
+        </w:rPr>
+        <w:t xml:space="preserve"> e o histograma dos dados.</w:t>
       </w:r>
     </w:p>
     <w:p>
@@ -139,7 +165,21 @@
         <w:rPr>
           <w:rFonts w:ascii="Segoe UI" w:hAnsi="Segoe UI" w:cs="Segoe UI"/>
         </w:rPr>
-        <w:t>Analise a mediana, os quartis, a distância interquartílica e amplitude. Relacione essa análise com o boxplot. Verifique se há outliers.</w:t>
+        <w:t xml:space="preserve">Analise a mediana, os quartis, a distância interquartílica e amplitude. Relacione essa análise com o </w:t>
+      </w:r>
+      <w:proofErr w:type="spellStart"/>
+      <w:r>
+        <w:rPr>
+          <w:rFonts w:ascii="Segoe UI" w:hAnsi="Segoe UI" w:cs="Segoe UI"/>
+        </w:rPr>
+        <w:t>boxplot</w:t>
+      </w:r>
+      <w:proofErr w:type="spellEnd"/>
+      <w:r>
+        <w:rPr>
+          <w:rFonts w:ascii="Segoe UI" w:hAnsi="Segoe UI" w:cs="Segoe UI"/>
+        </w:rPr>
+        <w:t>. Verifique se há outliers.</w:t>
       </w:r>
     </w:p>
     <w:p>
@@ -278,6 +318,12 @@
           <w:rFonts w:ascii="Segoe UI" w:hAnsi="Segoe UI" w:cs="Segoe UI"/>
         </w:rPr>
         <w:t xml:space="preserve">Resposta: </w:t>
+      </w:r>
+      <w:r>
+        <w:rPr>
+          <w:rFonts w:ascii="Segoe UI" w:hAnsi="Segoe UI" w:cs="Segoe UI"/>
+        </w:rPr>
+        <w:t>Mortes antes dos 5 anos por 1.000 pessoas</w:t>
       </w:r>
     </w:p>
     <w:p>
@@ -412,9 +458,19 @@
             <w:pPr>
               <w:jc w:val="center"/>
             </w:pPr>
-            <w:r>
-              <w:t>Desv. Pad</w:t>
-            </w:r>
+            <w:proofErr w:type="spellStart"/>
+            <w:r>
+              <w:t>Desv</w:t>
+            </w:r>
+            <w:proofErr w:type="spellEnd"/>
+            <w:r>
+              <w:t xml:space="preserve">. </w:t>
+            </w:r>
+            <w:proofErr w:type="spellStart"/>
+            <w:r>
+              <w:t>Pad</w:t>
+            </w:r>
+            <w:proofErr w:type="spellEnd"/>
           </w:p>
         </w:tc>
         <w:tc>
@@ -514,6 +570,13 @@
                 <w:szCs w:val="24"/>
               </w:rPr>
             </w:pPr>
+            <w:r>
+              <w:rPr>
+                <w:sz w:val="24"/>
+                <w:szCs w:val="24"/>
+              </w:rPr>
+              <w:t>2864</w:t>
+            </w:r>
           </w:p>
         </w:tc>
         <w:tc>
@@ -528,6 +591,13 @@
                 <w:szCs w:val="24"/>
               </w:rPr>
             </w:pPr>
+            <w:r>
+              <w:rPr>
+                <w:sz w:val="24"/>
+                <w:szCs w:val="24"/>
+              </w:rPr>
+              <w:t>42.93</w:t>
+            </w:r>
           </w:p>
         </w:tc>
         <w:tc>
@@ -542,6 +612,13 @@
                 <w:szCs w:val="24"/>
               </w:rPr>
             </w:pPr>
+            <w:r>
+              <w:rPr>
+                <w:sz w:val="24"/>
+                <w:szCs w:val="24"/>
+              </w:rPr>
+              <w:t>44.56</w:t>
+            </w:r>
           </w:p>
           <w:p>
             <w:pPr>
@@ -565,6 +642,13 @@
                 <w:szCs w:val="24"/>
               </w:rPr>
             </w:pPr>
+            <w:r>
+              <w:rPr>
+                <w:sz w:val="24"/>
+                <w:szCs w:val="24"/>
+              </w:rPr>
+              <w:t>2.30</w:t>
+            </w:r>
           </w:p>
         </w:tc>
         <w:tc>
@@ -579,6 +663,13 @@
                 <w:szCs w:val="24"/>
               </w:rPr>
             </w:pPr>
+            <w:r>
+              <w:rPr>
+                <w:sz w:val="24"/>
+                <w:szCs w:val="24"/>
+              </w:rPr>
+              <w:t>9.67</w:t>
+            </w:r>
           </w:p>
         </w:tc>
         <w:tc>
@@ -593,6 +684,13 @@
                 <w:szCs w:val="24"/>
               </w:rPr>
             </w:pPr>
+            <w:r>
+              <w:rPr>
+                <w:sz w:val="24"/>
+                <w:szCs w:val="24"/>
+              </w:rPr>
+              <w:t>23.1</w:t>
+            </w:r>
           </w:p>
         </w:tc>
         <w:tc>
@@ -607,6 +705,13 @@
                 <w:szCs w:val="24"/>
               </w:rPr>
             </w:pPr>
+            <w:r>
+              <w:rPr>
+                <w:sz w:val="24"/>
+                <w:szCs w:val="24"/>
+              </w:rPr>
+              <w:t>66</w:t>
+            </w:r>
           </w:p>
         </w:tc>
         <w:tc>
@@ -621,6 +726,13 @@
                 <w:szCs w:val="24"/>
               </w:rPr>
             </w:pPr>
+            <w:r>
+              <w:rPr>
+                <w:sz w:val="24"/>
+                <w:szCs w:val="24"/>
+              </w:rPr>
+              <w:t>224.90</w:t>
+            </w:r>
           </w:p>
         </w:tc>
       </w:tr>
@@ -705,9 +817,19 @@
             <w:pPr>
               <w:jc w:val="center"/>
             </w:pPr>
-            <w:r>
-              <w:t>Dist. Inter - quartílica</w:t>
-            </w:r>
+            <w:proofErr w:type="spellStart"/>
+            <w:r>
+              <w:t>Dist</w:t>
+            </w:r>
+            <w:proofErr w:type="spellEnd"/>
+            <w:r>
+              <w:t xml:space="preserve">. Inter - </w:t>
+            </w:r>
+            <w:proofErr w:type="spellStart"/>
+            <w:r>
+              <w:t>quartílica</w:t>
+            </w:r>
+            <w:proofErr w:type="spellEnd"/>
           </w:p>
         </w:tc>
         <w:tc>
@@ -719,8 +841,13 @@
             <w:pPr>
               <w:jc w:val="center"/>
             </w:pPr>
-            <w:r>
-              <w:t>Coef. de Variação</w:t>
+            <w:proofErr w:type="spellStart"/>
+            <w:r>
+              <w:t>Coef</w:t>
+            </w:r>
+            <w:proofErr w:type="spellEnd"/>
+            <w:r>
+              <w:t>. de Variação</w:t>
             </w:r>
           </w:p>
         </w:tc>
@@ -791,6 +918,13 @@
                 <w:szCs w:val="24"/>
               </w:rPr>
             </w:pPr>
+            <w:r>
+              <w:rPr>
+                <w:sz w:val="24"/>
+                <w:szCs w:val="24"/>
+              </w:rPr>
+              <w:t>222.6</w:t>
+            </w:r>
           </w:p>
         </w:tc>
         <w:tc>
@@ -805,6 +939,13 @@
                 <w:szCs w:val="24"/>
               </w:rPr>
             </w:pPr>
+            <w:r>
+              <w:rPr>
+                <w:sz w:val="24"/>
+                <w:szCs w:val="24"/>
+              </w:rPr>
+              <w:t>56.32</w:t>
+            </w:r>
           </w:p>
         </w:tc>
         <w:tc>
@@ -819,6 +960,13 @@
                 <w:szCs w:val="24"/>
               </w:rPr>
             </w:pPr>
+            <w:r>
+              <w:rPr>
+                <w:sz w:val="24"/>
+                <w:szCs w:val="24"/>
+              </w:rPr>
+              <w:t>1.03</w:t>
+            </w:r>
           </w:p>
           <w:p>
             <w:pPr>
@@ -842,6 +990,13 @@
                 <w:szCs w:val="24"/>
               </w:rPr>
             </w:pPr>
+            <w:r>
+              <w:rPr>
+                <w:sz w:val="24"/>
+                <w:szCs w:val="24"/>
+              </w:rPr>
+              <w:t>4.1</w:t>
+            </w:r>
           </w:p>
         </w:tc>
         <w:tc>
@@ -856,6 +1011,13 @@
                 <w:szCs w:val="24"/>
               </w:rPr>
             </w:pPr>
+            <w:r>
+              <w:rPr>
+                <w:sz w:val="24"/>
+                <w:szCs w:val="24"/>
+              </w:rPr>
+              <w:t>1.37</w:t>
+            </w:r>
           </w:p>
         </w:tc>
         <w:tc>
@@ -870,6 +1032,13 @@
                 <w:szCs w:val="24"/>
               </w:rPr>
             </w:pPr>
+            <w:r>
+              <w:rPr>
+                <w:sz w:val="24"/>
+                <w:szCs w:val="24"/>
+              </w:rPr>
+              <w:t>1.18</w:t>
+            </w:r>
           </w:p>
         </w:tc>
       </w:tr>
@@ -909,8 +1078,18 @@
           <w:b/>
           <w:bCs/>
         </w:rPr>
-        <w:t xml:space="preserve"> Histograma e seu Boxplot</w:t>
-      </w:r>
+        <w:t xml:space="preserve"> Histograma e seu </w:t>
+      </w:r>
+      <w:proofErr w:type="spellStart"/>
+      <w:r>
+        <w:rPr>
+          <w:rFonts w:ascii="Segoe UI" w:hAnsi="Segoe UI" w:cs="Segoe UI"/>
+          <w:b/>
+          <w:bCs/>
+        </w:rPr>
+        <w:t>Boxplot</w:t>
+      </w:r>
+      <w:proofErr w:type="spellEnd"/>
     </w:p>
     <w:p>
       <w:pPr>
@@ -920,6 +1099,71 @@
           <w:bCs/>
         </w:rPr>
       </w:pPr>
+      <w:r>
+        <w:rPr>
+          <w:rFonts w:ascii="Segoe UI" w:hAnsi="Segoe UI" w:cs="Segoe UI"/>
+          <w:b/>
+          <w:bCs/>
+        </w:rPr>
+        <w:lastRenderedPageBreak/>
+        <w:drawing>
+          <wp:anchor distT="0" distB="0" distL="114300" distR="114300" simplePos="0" relativeHeight="251658240" behindDoc="1" locked="0" layoutInCell="1" allowOverlap="1" wp14:anchorId="75F24FCD" wp14:editId="15CA6D05">
+            <wp:simplePos x="0" y="0"/>
+            <wp:positionH relativeFrom="column">
+              <wp:posOffset>2540</wp:posOffset>
+            </wp:positionH>
+            <wp:positionV relativeFrom="paragraph">
+              <wp:posOffset>2540</wp:posOffset>
+            </wp:positionV>
+            <wp:extent cx="6696710" cy="3501390"/>
+            <wp:effectExtent l="0" t="0" r="8890" b="3810"/>
+            <wp:wrapTight wrapText="bothSides">
+              <wp:wrapPolygon edited="0">
+                <wp:start x="0" y="0"/>
+                <wp:lineTo x="0" y="21506"/>
+                <wp:lineTo x="21567" y="21506"/>
+                <wp:lineTo x="21567" y="0"/>
+                <wp:lineTo x="0" y="0"/>
+              </wp:wrapPolygon>
+            </wp:wrapTight>
+            <wp:docPr id="1113860497" name="Imagem 1"/>
+            <wp:cNvGraphicFramePr>
+              <a:graphicFrameLocks xmlns:a="http://schemas.openxmlformats.org/drawingml/2006/main" noChangeAspect="1"/>
+            </wp:cNvGraphicFramePr>
+            <a:graphic xmlns:a="http://schemas.openxmlformats.org/drawingml/2006/main">
+              <a:graphicData uri="http://schemas.openxmlformats.org/drawingml/2006/picture">
+                <pic:pic xmlns:pic="http://schemas.openxmlformats.org/drawingml/2006/picture">
+                  <pic:nvPicPr>
+                    <pic:cNvPr id="1113860497" name=""/>
+                    <pic:cNvPicPr/>
+                  </pic:nvPicPr>
+                  <pic:blipFill>
+                    <a:blip r:embed="rId8" cstate="print">
+                      <a:extLst>
+                        <a:ext uri="{28A0092B-C50C-407E-A947-70E740481C1C}">
+                          <a14:useLocalDpi xmlns:a14="http://schemas.microsoft.com/office/drawing/2010/main" val="0"/>
+                        </a:ext>
+                      </a:extLst>
+                    </a:blip>
+                    <a:stretch>
+                      <a:fillRect/>
+                    </a:stretch>
+                  </pic:blipFill>
+                  <pic:spPr>
+                    <a:xfrm>
+                      <a:off x="0" y="0"/>
+                      <a:ext cx="6696710" cy="3501390"/>
+                    </a:xfrm>
+                    <a:prstGeom prst="rect">
+                      <a:avLst/>
+                    </a:prstGeom>
+                  </pic:spPr>
+                </pic:pic>
+              </a:graphicData>
+            </a:graphic>
+          </wp:anchor>
+        </w:drawing>
+      </w:r>
     </w:p>
     <w:p>
       <w:pPr>
@@ -958,7 +1202,7 @@
       </w:r>
     </w:p>
     <w:sectPr>
-      <w:headerReference w:type="default" r:id="rId8"/>
+      <w:headerReference w:type="default" r:id="rId9"/>
       <w:pgSz w:w="11906" w:h="16838" w:code="9"/>
       <w:pgMar w:top="567" w:right="680" w:bottom="567" w:left="680" w:header="0" w:footer="284" w:gutter="0"/>
       <w:cols w:space="708"/>
@@ -1135,7 +1379,23 @@
               <w:sz w:val="24"/>
               <w:szCs w:val="24"/>
             </w:rPr>
-            <w:t xml:space="preserve">:                          </w:t>
+            <w:t xml:space="preserve">:            </w:t>
+          </w:r>
+          <w:r>
+            <w:rPr>
+              <w:rFonts w:ascii="Segoe UI" w:hAnsi="Segoe UI" w:cs="Segoe UI"/>
+              <w:sz w:val="24"/>
+              <w:szCs w:val="24"/>
+            </w:rPr>
+            <w:t>Wederson Cabral Domingues</w:t>
+          </w:r>
+          <w:r>
+            <w:rPr>
+              <w:rFonts w:ascii="Segoe UI" w:hAnsi="Segoe UI" w:cs="Segoe UI"/>
+              <w:sz w:val="24"/>
+              <w:szCs w:val="24"/>
+            </w:rPr>
+            <w:t xml:space="preserve">              </w:t>
           </w:r>
         </w:p>
         <w:p>

</xml_diff>

<commit_message>
Preenchendo a atividade de análise descritiva
</commit_message>
<xml_diff>
--- a/Análise descritiva de dados numéricos.docx
+++ b/Análise descritiva de dados numéricos.docx
@@ -995,7 +995,35 @@
                 <w:sz w:val="24"/>
                 <w:szCs w:val="24"/>
               </w:rPr>
-              <w:t>4.1</w:t>
+              <w:t xml:space="preserve">2.3 </w:t>
+            </w:r>
+            <w:r>
+              <w:rPr>
+                <w:sz w:val="24"/>
+                <w:szCs w:val="24"/>
+              </w:rPr>
+              <w:t>–</w:t>
+            </w:r>
+            <w:r>
+              <w:rPr>
+                <w:sz w:val="24"/>
+                <w:szCs w:val="24"/>
+              </w:rPr>
+              <w:t xml:space="preserve"> </w:t>
+            </w:r>
+            <w:r>
+              <w:rPr>
+                <w:sz w:val="24"/>
+                <w:szCs w:val="24"/>
+              </w:rPr>
+              <w:t xml:space="preserve">7.86           </w:t>
+            </w:r>
+            <w:r>
+              <w:rPr>
+                <w:sz w:val="24"/>
+                <w:szCs w:val="24"/>
+              </w:rPr>
+              <w:t># 578</w:t>
             </w:r>
           </w:p>
         </w:tc>
@@ -1097,36 +1125,31 @@
           <w:rFonts w:ascii="Segoe UI" w:hAnsi="Segoe UI" w:cs="Segoe UI"/>
           <w:b/>
           <w:bCs/>
-        </w:rPr>
-      </w:pPr>
-      <w:r>
+          <w:noProof/>
+        </w:rPr>
+      </w:pPr>
+    </w:p>
+    <w:p>
+      <w:pPr>
         <w:rPr>
           <w:rFonts w:ascii="Segoe UI" w:hAnsi="Segoe UI" w:cs="Segoe UI"/>
           <w:b/>
           <w:bCs/>
         </w:rPr>
+      </w:pPr>
+      <w:r>
+        <w:rPr>
+          <w:rFonts w:ascii="Segoe UI" w:hAnsi="Segoe UI" w:cs="Segoe UI"/>
+          <w:b/>
+          <w:bCs/>
+          <w:noProof/>
+        </w:rPr>
         <w:lastRenderedPageBreak/>
         <w:drawing>
-          <wp:anchor distT="0" distB="0" distL="114300" distR="114300" simplePos="0" relativeHeight="251658240" behindDoc="1" locked="0" layoutInCell="1" allowOverlap="1" wp14:anchorId="75F24FCD" wp14:editId="15CA6D05">
-            <wp:simplePos x="0" y="0"/>
-            <wp:positionH relativeFrom="column">
-              <wp:posOffset>2540</wp:posOffset>
-            </wp:positionH>
-            <wp:positionV relativeFrom="paragraph">
-              <wp:posOffset>2540</wp:posOffset>
-            </wp:positionV>
-            <wp:extent cx="6696710" cy="3501390"/>
-            <wp:effectExtent l="0" t="0" r="8890" b="3810"/>
-            <wp:wrapTight wrapText="bothSides">
-              <wp:wrapPolygon edited="0">
-                <wp:start x="0" y="0"/>
-                <wp:lineTo x="0" y="21506"/>
-                <wp:lineTo x="21567" y="21506"/>
-                <wp:lineTo x="21567" y="0"/>
-                <wp:lineTo x="0" y="0"/>
-              </wp:wrapPolygon>
-            </wp:wrapTight>
-            <wp:docPr id="1113860497" name="Imagem 1"/>
+          <wp:inline distT="0" distB="0" distL="0" distR="0" wp14:anchorId="171040D8" wp14:editId="583F9ECE">
+            <wp:extent cx="5581650" cy="3086735"/>
+            <wp:effectExtent l="0" t="0" r="0" b="0"/>
+            <wp:docPr id="961376837" name="Imagem 1"/>
             <wp:cNvGraphicFramePr>
               <a:graphicFrameLocks xmlns:a="http://schemas.openxmlformats.org/drawingml/2006/main" noChangeAspect="1"/>
             </wp:cNvGraphicFramePr>
@@ -1134,10 +1157,10 @@
               <a:graphicData uri="http://schemas.openxmlformats.org/drawingml/2006/picture">
                 <pic:pic xmlns:pic="http://schemas.openxmlformats.org/drawingml/2006/picture">
                   <pic:nvPicPr>
-                    <pic:cNvPr id="1113860497" name=""/>
+                    <pic:cNvPr id="961376837" name="Imagem 961376837"/>
                     <pic:cNvPicPr/>
                   </pic:nvPicPr>
-                  <pic:blipFill>
+                  <pic:blipFill rotWithShape="1">
                     <a:blip r:embed="rId8" cstate="print">
                       <a:extLst>
                         <a:ext uri="{28A0092B-C50C-407E-A947-70E740481C1C}">
@@ -1145,23 +1168,32 @@
                         </a:ext>
                       </a:extLst>
                     </a:blip>
+                    <a:srcRect l="7680" t="8473" r="8970"/>
                     <a:stretch>
                       <a:fillRect/>
                     </a:stretch>
                   </pic:blipFill>
-                  <pic:spPr>
+                  <pic:spPr bwMode="auto">
                     <a:xfrm>
                       <a:off x="0" y="0"/>
-                      <a:ext cx="6696710" cy="3501390"/>
+                      <a:ext cx="5581650" cy="3086735"/>
                     </a:xfrm>
                     <a:prstGeom prst="rect">
                       <a:avLst/>
                     </a:prstGeom>
+                    <a:ln>
+                      <a:noFill/>
+                    </a:ln>
+                    <a:extLst>
+                      <a:ext uri="{53640926-AAD7-44D8-BBD7-CCE9431645EC}">
+                        <a14:shadowObscured xmlns:a14="http://schemas.microsoft.com/office/drawing/2010/main"/>
+                      </a:ext>
+                    </a:extLst>
                   </pic:spPr>
                 </pic:pic>
               </a:graphicData>
             </a:graphic>
-          </wp:anchor>
+          </wp:inline>
         </w:drawing>
       </w:r>
     </w:p>
@@ -1190,15 +1222,305 @@
     <w:p>
       <w:pPr>
         <w:pStyle w:val="PargrafodaLista"/>
-        <w:rPr>
-          <w:rFonts w:ascii="Segoe UI" w:hAnsi="Segoe UI" w:cs="Segoe UI"/>
-        </w:rPr>
-      </w:pPr>
-      <w:r>
-        <w:rPr>
-          <w:rFonts w:ascii="Segoe UI" w:hAnsi="Segoe UI" w:cs="Segoe UI"/>
-        </w:rPr>
-        <w:t>Análise</w:t>
+        <w:jc w:val="both"/>
+        <w:rPr>
+          <w:rFonts w:ascii="Segoe UI" w:hAnsi="Segoe UI" w:cs="Segoe UI"/>
+        </w:rPr>
+      </w:pPr>
+      <w:r>
+        <w:rPr>
+          <w:rFonts w:ascii="Segoe UI" w:hAnsi="Segoe UI" w:cs="Segoe UI"/>
+        </w:rPr>
+        <w:t>A primeira conclusão que podemos ter ao analisar a distribuição dos dados é a baixa confiança que podemos ter na média. Essa conclusão é perceptível pelo coeficiente de variação acima de 1 e pelo valor da média ser quase o dobro da mediana.</w:t>
+      </w:r>
+    </w:p>
+    <w:p>
+      <w:pPr>
+        <w:pStyle w:val="PargrafodaLista"/>
+        <w:jc w:val="both"/>
+        <w:rPr>
+          <w:rFonts w:ascii="Segoe UI" w:hAnsi="Segoe UI" w:cs="Segoe UI"/>
+        </w:rPr>
+      </w:pPr>
+    </w:p>
+    <w:p>
+      <w:pPr>
+        <w:pStyle w:val="PargrafodaLista"/>
+        <w:jc w:val="both"/>
+        <w:rPr>
+          <w:rFonts w:ascii="Segoe UI" w:hAnsi="Segoe UI" w:cs="Segoe UI"/>
+        </w:rPr>
+      </w:pPr>
+      <w:r>
+        <w:rPr>
+          <w:rFonts w:ascii="Segoe UI" w:hAnsi="Segoe UI" w:cs="Segoe UI"/>
+        </w:rPr>
+        <w:t xml:space="preserve">Esse valor alto da média, em relação aos outros indicadores, indica uma presença alta de </w:t>
+      </w:r>
+      <w:proofErr w:type="spellStart"/>
+      <w:r>
+        <w:rPr>
+          <w:rFonts w:ascii="Segoe UI" w:hAnsi="Segoe UI" w:cs="Segoe UI"/>
+        </w:rPr>
+        <w:t>outliners</w:t>
+      </w:r>
+      <w:proofErr w:type="spellEnd"/>
+      <w:r>
+        <w:rPr>
+          <w:rFonts w:ascii="Segoe UI" w:hAnsi="Segoe UI" w:cs="Segoe UI"/>
+        </w:rPr>
+        <w:t xml:space="preserve"> positivos. Isso também é confirmado pelo gráfico de </w:t>
+      </w:r>
+      <w:proofErr w:type="spellStart"/>
+      <w:proofErr w:type="gramStart"/>
+      <w:r>
+        <w:rPr>
+          <w:rFonts w:ascii="Segoe UI" w:hAnsi="Segoe UI" w:cs="Segoe UI"/>
+        </w:rPr>
+        <w:t>boxplot</w:t>
+      </w:r>
+      <w:proofErr w:type="spellEnd"/>
+      <w:r>
+        <w:rPr>
+          <w:rFonts w:ascii="Segoe UI" w:hAnsi="Segoe UI" w:cs="Segoe UI"/>
+        </w:rPr>
+        <w:t>(</w:t>
+      </w:r>
+      <w:proofErr w:type="gramEnd"/>
+      <w:r>
+        <w:rPr>
+          <w:rFonts w:ascii="Segoe UI" w:hAnsi="Segoe UI" w:cs="Segoe UI"/>
+        </w:rPr>
+        <w:t>muitos pontos acima do limite superior) e pelo indicador de amplitude que também é alto.</w:t>
+      </w:r>
+    </w:p>
+    <w:p>
+      <w:pPr>
+        <w:pStyle w:val="PargrafodaLista"/>
+        <w:jc w:val="both"/>
+        <w:rPr>
+          <w:rFonts w:ascii="Segoe UI" w:hAnsi="Segoe UI" w:cs="Segoe UI"/>
+        </w:rPr>
+      </w:pPr>
+    </w:p>
+    <w:p>
+      <w:pPr>
+        <w:pStyle w:val="PargrafodaLista"/>
+        <w:jc w:val="both"/>
+        <w:rPr>
+          <w:rFonts w:ascii="Segoe UI" w:hAnsi="Segoe UI" w:cs="Segoe UI"/>
+        </w:rPr>
+      </w:pPr>
+      <w:r>
+        <w:rPr>
+          <w:rFonts w:ascii="Segoe UI" w:hAnsi="Segoe UI" w:cs="Segoe UI"/>
+        </w:rPr>
+        <w:t xml:space="preserve">No </w:t>
+      </w:r>
+      <w:proofErr w:type="spellStart"/>
+      <w:r>
+        <w:rPr>
+          <w:rFonts w:ascii="Segoe UI" w:hAnsi="Segoe UI" w:cs="Segoe UI"/>
+        </w:rPr>
+        <w:t>boxplot</w:t>
+      </w:r>
+      <w:proofErr w:type="spellEnd"/>
+      <w:r>
+        <w:rPr>
+          <w:rFonts w:ascii="Segoe UI" w:hAnsi="Segoe UI" w:cs="Segoe UI"/>
+        </w:rPr>
+        <w:t xml:space="preserve"> podemos perceber que a maioria dos valores estão abaixo do terceiro quartil e que o interquartil </w:t>
+      </w:r>
+      <w:proofErr w:type="spellStart"/>
+      <w:proofErr w:type="gramStart"/>
+      <w:r>
+        <w:rPr>
+          <w:rFonts w:ascii="Segoe UI" w:hAnsi="Segoe UI" w:cs="Segoe UI"/>
+        </w:rPr>
+        <w:t>esta</w:t>
+      </w:r>
+      <w:proofErr w:type="spellEnd"/>
+      <w:proofErr w:type="gramEnd"/>
+      <w:r>
+        <w:rPr>
+          <w:rFonts w:ascii="Segoe UI" w:hAnsi="Segoe UI" w:cs="Segoe UI"/>
+        </w:rPr>
+        <w:t xml:space="preserve"> muito distante do limite superior, o que reforça análise indicando uma distribuição assimétrica positiva.</w:t>
+      </w:r>
+    </w:p>
+    <w:p>
+      <w:pPr>
+        <w:pStyle w:val="PargrafodaLista"/>
+        <w:jc w:val="both"/>
+        <w:rPr>
+          <w:rFonts w:ascii="Segoe UI" w:hAnsi="Segoe UI" w:cs="Segoe UI"/>
+        </w:rPr>
+      </w:pPr>
+    </w:p>
+    <w:p>
+      <w:pPr>
+        <w:pStyle w:val="PargrafodaLista"/>
+        <w:jc w:val="both"/>
+        <w:rPr>
+          <w:rFonts w:ascii="Segoe UI" w:hAnsi="Segoe UI" w:cs="Segoe UI"/>
+        </w:rPr>
+      </w:pPr>
+      <w:r>
+        <w:rPr>
+          <w:rFonts w:ascii="Segoe UI" w:hAnsi="Segoe UI" w:cs="Segoe UI"/>
+        </w:rPr>
+        <w:t>O indicador de Curtose ser acima de 0 indica que estamos diante de uma base '</w:t>
+      </w:r>
+      <w:proofErr w:type="spellStart"/>
+      <w:r>
+        <w:rPr>
+          <w:rFonts w:ascii="Segoe UI" w:hAnsi="Segoe UI" w:cs="Segoe UI"/>
+        </w:rPr>
+        <w:t>Leptocúrtica</w:t>
+      </w:r>
+      <w:proofErr w:type="spellEnd"/>
+      <w:r>
+        <w:rPr>
+          <w:rFonts w:ascii="Segoe UI" w:hAnsi="Segoe UI" w:cs="Segoe UI"/>
+        </w:rPr>
+        <w:t>', ou seja, mais alongada e com caudas pesadas. É possível chegar na mesma conclusão ao averiguarmos o histograma, onde temos uma longa calda a direita da mediana e da média.</w:t>
+      </w:r>
+    </w:p>
+    <w:p>
+      <w:pPr>
+        <w:pStyle w:val="PargrafodaLista"/>
+        <w:jc w:val="both"/>
+        <w:rPr>
+          <w:rFonts w:ascii="Segoe UI" w:hAnsi="Segoe UI" w:cs="Segoe UI"/>
+        </w:rPr>
+      </w:pPr>
+    </w:p>
+    <w:p>
+      <w:pPr>
+        <w:pStyle w:val="PargrafodaLista"/>
+        <w:jc w:val="both"/>
+        <w:rPr>
+          <w:rFonts w:ascii="Segoe UI" w:hAnsi="Segoe UI" w:cs="Segoe UI"/>
+        </w:rPr>
+      </w:pPr>
+      <w:r>
+        <w:rPr>
+          <w:rFonts w:ascii="Segoe UI" w:hAnsi="Segoe UI" w:cs="Segoe UI"/>
+        </w:rPr>
+        <w:t xml:space="preserve">Um dos principais indicadores de distorção da base é o fato de que a moda </w:t>
+      </w:r>
+      <w:proofErr w:type="spellStart"/>
+      <w:proofErr w:type="gramStart"/>
+      <w:r>
+        <w:rPr>
+          <w:rFonts w:ascii="Segoe UI" w:hAnsi="Segoe UI" w:cs="Segoe UI"/>
+        </w:rPr>
+        <w:t>esta</w:t>
+      </w:r>
+      <w:proofErr w:type="spellEnd"/>
+      <w:proofErr w:type="gramEnd"/>
+      <w:r>
+        <w:rPr>
+          <w:rFonts w:ascii="Segoe UI" w:hAnsi="Segoe UI" w:cs="Segoe UI"/>
+        </w:rPr>
+        <w:t xml:space="preserve"> na primeira classe do nosso histograma, o que é muito incomum. Possuindo um N de 2.864, 578(20%) registros estão na primeira classe, entre 2,3 e 7,86.</w:t>
+      </w:r>
+    </w:p>
+    <w:p>
+      <w:pPr>
+        <w:pStyle w:val="PargrafodaLista"/>
+        <w:jc w:val="both"/>
+        <w:rPr>
+          <w:rFonts w:ascii="Segoe UI" w:hAnsi="Segoe UI" w:cs="Segoe UI"/>
+        </w:rPr>
+      </w:pPr>
+    </w:p>
+    <w:p>
+      <w:pPr>
+        <w:pStyle w:val="PargrafodaLista"/>
+        <w:jc w:val="both"/>
+        <w:rPr>
+          <w:rFonts w:ascii="Segoe UI" w:hAnsi="Segoe UI" w:cs="Segoe UI"/>
+        </w:rPr>
+      </w:pPr>
+      <w:r>
+        <w:rPr>
+          <w:rFonts w:ascii="Segoe UI" w:hAnsi="Segoe UI" w:cs="Segoe UI"/>
+        </w:rPr>
+        <w:t xml:space="preserve">Como demostrado pela análise nos parágrafos anteriores, temos uma alta assimetria positiva puxada por muitos </w:t>
+      </w:r>
+      <w:proofErr w:type="spellStart"/>
+      <w:r>
+        <w:rPr>
+          <w:rFonts w:ascii="Segoe UI" w:hAnsi="Segoe UI" w:cs="Segoe UI"/>
+        </w:rPr>
+        <w:t>outliners</w:t>
+      </w:r>
+      <w:proofErr w:type="spellEnd"/>
+      <w:r>
+        <w:rPr>
+          <w:rFonts w:ascii="Segoe UI" w:hAnsi="Segoe UI" w:cs="Segoe UI"/>
+        </w:rPr>
+        <w:t xml:space="preserve">. Caso analisássemos a base apenas pela mediana ou média, </w:t>
+      </w:r>
+      <w:r>
+        <w:rPr>
+          <w:rFonts w:ascii="Segoe UI" w:hAnsi="Segoe UI" w:cs="Segoe UI"/>
+        </w:rPr>
+        <w:lastRenderedPageBreak/>
+        <w:t xml:space="preserve">teríamos a impressão de um cenário global pior, em relação a mortalidade infantil, do que a realidade mostra. </w:t>
+      </w:r>
+      <w:proofErr w:type="gramStart"/>
+      <w:r>
+        <w:rPr>
+          <w:rFonts w:ascii="Segoe UI" w:hAnsi="Segoe UI" w:cs="Segoe UI"/>
+        </w:rPr>
+        <w:t>A</w:t>
+      </w:r>
+      <w:proofErr w:type="gramEnd"/>
+      <w:r>
+        <w:rPr>
+          <w:rFonts w:ascii="Segoe UI" w:hAnsi="Segoe UI" w:cs="Segoe UI"/>
+        </w:rPr>
+        <w:t xml:space="preserve"> medida que melhor descreve o indicador é a Moda.</w:t>
+      </w:r>
+    </w:p>
+    <w:p>
+      <w:pPr>
+        <w:pStyle w:val="PargrafodaLista"/>
+        <w:jc w:val="both"/>
+        <w:rPr>
+          <w:rFonts w:ascii="Segoe UI" w:hAnsi="Segoe UI" w:cs="Segoe UI"/>
+        </w:rPr>
+      </w:pPr>
+    </w:p>
+    <w:p>
+      <w:pPr>
+        <w:pStyle w:val="PargrafodaLista"/>
+        <w:jc w:val="both"/>
+        <w:rPr>
+          <w:rFonts w:ascii="Segoe UI" w:hAnsi="Segoe UI" w:cs="Segoe UI"/>
+        </w:rPr>
+      </w:pPr>
+      <w:r>
+        <w:rPr>
+          <w:rFonts w:ascii="Segoe UI" w:hAnsi="Segoe UI" w:cs="Segoe UI"/>
+        </w:rPr>
+        <w:t xml:space="preserve">Ainda considerando o indicador ser relacionado a morte de crianças, tantos </w:t>
+      </w:r>
+      <w:proofErr w:type="spellStart"/>
+      <w:r>
+        <w:rPr>
+          <w:rFonts w:ascii="Segoe UI" w:hAnsi="Segoe UI" w:cs="Segoe UI"/>
+        </w:rPr>
+        <w:t>outliners</w:t>
+      </w:r>
+      <w:proofErr w:type="spellEnd"/>
+      <w:r>
+        <w:rPr>
+          <w:rFonts w:ascii="Segoe UI" w:hAnsi="Segoe UI" w:cs="Segoe UI"/>
+        </w:rPr>
+        <w:t xml:space="preserve"> devem criar um alerta nesses países, pois estão apresentando problemas que já foram resolvidos pela maior parte do mundo.</w:t>
       </w:r>
     </w:p>
     <w:sectPr>

</xml_diff>